<commit_message>
Initial commit with SSH key configured
</commit_message>
<xml_diff>
--- a/Assignment_4.docx
+++ b/Assignment_4.docx
@@ -293,14 +293,13 @@
       <w:pPr>
         <w:rPr>
           <w:rFonts w:ascii="Arial" w:hAnsi="Arial" w:cs="Arial"/>
-          <w:b/>
           <w:color w:val="000000"/>
         </w:rPr>
       </w:pPr>
       <w:r>
         <w:lastRenderedPageBreak/>
         <w:drawing>
-          <wp:inline distT="0" distB="0" distL="0" distR="0" wp14:anchorId="44A31C51" wp14:editId="4082351B">
+          <wp:inline distT="0" distB="0" distL="0" distR="0" wp14:anchorId="0055BA6E" wp14:editId="73DDC2C8">
             <wp:extent cx="5731510" cy="192887"/>
             <wp:effectExtent l="0" t="0" r="0" b="0"/>
             <wp:docPr id="5" name="Picture 5"/>
@@ -340,7 +339,7 @@
       </w:r>
       <w:r>
         <w:drawing>
-          <wp:inline distT="0" distB="0" distL="0" distR="0" wp14:anchorId="0D236BF8" wp14:editId="30490E4A">
+          <wp:inline distT="0" distB="0" distL="0" distR="0" wp14:anchorId="1D867509" wp14:editId="4A449E3B">
             <wp:extent cx="5731510" cy="1783749"/>
             <wp:effectExtent l="0" t="0" r="2540" b="6985"/>
             <wp:docPr id="6" name="Picture 6"/>
@@ -380,7 +379,7 @@
       </w:r>
       <w:r>
         <w:drawing>
-          <wp:inline distT="0" distB="0" distL="0" distR="0" wp14:anchorId="26A1FF70" wp14:editId="6E8E0EEF">
+          <wp:inline distT="0" distB="0" distL="0" distR="0" wp14:anchorId="45770D9B" wp14:editId="0351DACA">
             <wp:extent cx="5731510" cy="1186716"/>
             <wp:effectExtent l="0" t="0" r="2540" b="0"/>
             <wp:docPr id="7" name="Picture 7"/>
@@ -416,25 +415,62 @@
         </w:drawing>
       </w:r>
       <w:r>
+        <w:rPr>
+          <w:rFonts w:ascii="Arial" w:hAnsi="Arial" w:cs="Arial"/>
+          <w:b/>
+          <w:color w:val="000000"/>
+        </w:rPr>
         <w:br/>
       </w:r>
-      <w:proofErr w:type="gramStart"/>
-      <w:r>
-        <w:rPr>
-          <w:rFonts w:ascii="Arial" w:hAnsi="Arial" w:cs="Arial"/>
-          <w:b/>
-          <w:color w:val="000000"/>
-        </w:rPr>
-        <w:t>3 .</w:t>
-      </w:r>
-      <w:proofErr w:type="gramEnd"/>
-      <w:r>
-        <w:rPr>
-          <w:rFonts w:ascii="Arial" w:hAnsi="Arial" w:cs="Arial"/>
-          <w:b/>
-          <w:color w:val="000000"/>
-        </w:rPr>
-        <w:t xml:space="preserve"> </w:t>
+      <w:r>
+        <w:drawing>
+          <wp:inline distT="0" distB="0" distL="0" distR="0" wp14:anchorId="136109E3" wp14:editId="7DC388BA">
+            <wp:extent cx="5731510" cy="2043994"/>
+            <wp:effectExtent l="0" t="0" r="2540" b="0"/>
+            <wp:docPr id="10" name="Picture 10"/>
+            <wp:cNvGraphicFramePr>
+              <a:graphicFrameLocks xmlns:a="http://schemas.openxmlformats.org/drawingml/2006/main" noChangeAspect="1"/>
+            </wp:cNvGraphicFramePr>
+            <a:graphic xmlns:a="http://schemas.openxmlformats.org/drawingml/2006/main">
+              <a:graphicData uri="http://schemas.openxmlformats.org/drawingml/2006/picture">
+                <pic:pic xmlns:pic="http://schemas.openxmlformats.org/drawingml/2006/picture">
+                  <pic:nvPicPr>
+                    <pic:cNvPr id="0" name=""/>
+                    <pic:cNvPicPr/>
+                  </pic:nvPicPr>
+                  <pic:blipFill>
+                    <a:blip r:embed="rId13"/>
+                    <a:stretch>
+                      <a:fillRect/>
+                    </a:stretch>
+                  </pic:blipFill>
+                  <pic:spPr>
+                    <a:xfrm>
+                      <a:off x="0" y="0"/>
+                      <a:ext cx="5731510" cy="2043994"/>
+                    </a:xfrm>
+                    <a:prstGeom prst="rect">
+                      <a:avLst/>
+                    </a:prstGeom>
+                  </pic:spPr>
+                </pic:pic>
+              </a:graphicData>
+            </a:graphic>
+          </wp:inline>
+        </w:drawing>
+      </w:r>
+      <w:bookmarkStart w:id="0" w:name="_GoBack"/>
+      <w:bookmarkEnd w:id="0"/>
+      <w:r>
+        <w:br/>
+      </w:r>
+      <w:r>
+        <w:rPr>
+          <w:rFonts w:ascii="Arial" w:hAnsi="Arial" w:cs="Arial"/>
+          <w:b/>
+          <w:color w:val="000000"/>
+        </w:rPr>
+        <w:t xml:space="preserve">3 . </w:t>
       </w:r>
       <w:r>
         <w:rPr>
@@ -481,6 +517,7 @@
         <w:t>ans</w:t>
       </w:r>
       <w:proofErr w:type="spellEnd"/>
+      <w:proofErr w:type="gramEnd"/>
       <w:r>
         <w:rPr>
           <w:rFonts w:ascii="Arial" w:hAnsi="Arial" w:cs="Arial"/>
@@ -489,11 +526,186 @@
         </w:rPr>
         <w:t xml:space="preserve"> :</w:t>
       </w:r>
-      <w:proofErr w:type="gramEnd"/>
+      <w:r>
+        <w:rPr>
+          <w:rFonts w:ascii="Arial" w:hAnsi="Arial" w:cs="Arial"/>
+          <w:b/>
+          <w:color w:val="000000"/>
+        </w:rPr>
+        <w:br/>
+      </w:r>
+      <w:r>
+        <w:rPr>
+          <w:rFonts w:ascii="Arial" w:hAnsi="Arial" w:cs="Arial"/>
+          <w:color w:val="000000"/>
+        </w:rPr>
+        <w:t xml:space="preserve">command : </w:t>
+      </w:r>
+      <w:r>
+        <w:rPr>
+          <w:rFonts w:ascii="Arial" w:hAnsi="Arial" w:cs="Arial"/>
+          <w:color w:val="000000"/>
+        </w:rPr>
+        <w:t xml:space="preserve">git checkout -b </w:t>
+      </w:r>
+      <w:proofErr w:type="spellStart"/>
+      <w:r>
+        <w:rPr>
+          <w:rFonts w:ascii="Arial" w:hAnsi="Arial" w:cs="Arial"/>
+          <w:color w:val="000000"/>
+        </w:rPr>
+        <w:t>Tutedude_sattibhan</w:t>
+      </w:r>
+      <w:proofErr w:type="spellEnd"/>
     </w:p>
     <w:p>
-      <w:bookmarkStart w:id="0" w:name="_GoBack"/>
-      <w:bookmarkEnd w:id="0"/>
+      <w:pPr>
+        <w:rPr>
+          <w:rFonts w:ascii="Arial" w:hAnsi="Arial" w:cs="Arial"/>
+          <w:color w:val="000000"/>
+        </w:rPr>
+      </w:pPr>
+      <w:r>
+        <w:rPr>
+          <w:rFonts w:ascii="Arial" w:hAnsi="Arial" w:cs="Arial"/>
+          <w:color w:val="000000"/>
+        </w:rPr>
+        <w:drawing>
+          <wp:inline distT="0" distB="0" distL="0" distR="0" wp14:anchorId="2DDEF709" wp14:editId="1C52283B">
+            <wp:extent cx="5731510" cy="989543"/>
+            <wp:effectExtent l="0" t="0" r="2540" b="1270"/>
+            <wp:docPr id="8" name="Picture 8"/>
+            <wp:cNvGraphicFramePr>
+              <a:graphicFrameLocks xmlns:a="http://schemas.openxmlformats.org/drawingml/2006/main" noChangeAspect="1"/>
+            </wp:cNvGraphicFramePr>
+            <a:graphic xmlns:a="http://schemas.openxmlformats.org/drawingml/2006/main">
+              <a:graphicData uri="http://schemas.openxmlformats.org/drawingml/2006/picture">
+                <pic:pic xmlns:pic="http://schemas.openxmlformats.org/drawingml/2006/picture">
+                  <pic:nvPicPr>
+                    <pic:cNvPr id="0" name=""/>
+                    <pic:cNvPicPr/>
+                  </pic:nvPicPr>
+                  <pic:blipFill>
+                    <a:blip r:embed="rId14"/>
+                    <a:stretch>
+                      <a:fillRect/>
+                    </a:stretch>
+                  </pic:blipFill>
+                  <pic:spPr>
+                    <a:xfrm>
+                      <a:off x="0" y="0"/>
+                      <a:ext cx="5731510" cy="989543"/>
+                    </a:xfrm>
+                    <a:prstGeom prst="rect">
+                      <a:avLst/>
+                    </a:prstGeom>
+                  </pic:spPr>
+                </pic:pic>
+              </a:graphicData>
+            </a:graphic>
+          </wp:inline>
+        </w:drawing>
+      </w:r>
+    </w:p>
+    <w:p>
+      <w:pPr>
+        <w:pStyle w:val="NormalWeb"/>
+        <w:numPr>
+          <w:ilvl w:val="0"/>
+          <w:numId w:val="4"/>
+        </w:numPr>
+        <w:spacing w:before="0" w:beforeAutospacing="0" w:after="0" w:afterAutospacing="0"/>
+        <w:textAlignment w:val="baseline"/>
+        <w:rPr>
+          <w:rFonts w:ascii="Arial" w:hAnsi="Arial" w:cs="Arial"/>
+          <w:b/>
+          <w:color w:val="000000"/>
+        </w:rPr>
+      </w:pPr>
+      <w:r>
+        <w:rPr>
+          <w:rFonts w:ascii="Arial" w:hAnsi="Arial" w:cs="Arial"/>
+          <w:b/>
+          <w:color w:val="000000"/>
+        </w:rPr>
+        <w:t>Add your Flask project files to this branch.</w:t>
+      </w:r>
+    </w:p>
+    <w:p>
+      <w:proofErr w:type="spellStart"/>
+      <w:proofErr w:type="gramStart"/>
+      <w:r>
+        <w:t>Ans</w:t>
+      </w:r>
+      <w:proofErr w:type="spellEnd"/>
+      <w:r>
+        <w:t xml:space="preserve"> :</w:t>
+      </w:r>
+      <w:proofErr w:type="gramEnd"/>
+      <w:r>
+        <w:br/>
+        <w:t>command :</w:t>
+      </w:r>
+    </w:p>
+    <w:p>
+      <w:proofErr w:type="gramStart"/>
+      <w:r>
+        <w:t>git</w:t>
+      </w:r>
+      <w:proofErr w:type="gramEnd"/>
+      <w:r>
+        <w:t xml:space="preserve"> add .</w:t>
+      </w:r>
+    </w:p>
+    <w:p>
+      <w:proofErr w:type="gramStart"/>
+      <w:r>
+        <w:t>git</w:t>
+      </w:r>
+      <w:proofErr w:type="gramEnd"/>
+      <w:r>
+        <w:t xml:space="preserve"> commit -m " Flask project add "</w:t>
+      </w:r>
+    </w:p>
+    <w:p>
+      <w:r>
+        <w:lastRenderedPageBreak/>
+        <w:drawing>
+          <wp:inline distT="0" distB="0" distL="0" distR="0" wp14:anchorId="69923FE0" wp14:editId="47010309">
+            <wp:extent cx="5731510" cy="1940508"/>
+            <wp:effectExtent l="0" t="0" r="2540" b="3175"/>
+            <wp:docPr id="9" name="Picture 9"/>
+            <wp:cNvGraphicFramePr>
+              <a:graphicFrameLocks xmlns:a="http://schemas.openxmlformats.org/drawingml/2006/main" noChangeAspect="1"/>
+            </wp:cNvGraphicFramePr>
+            <a:graphic xmlns:a="http://schemas.openxmlformats.org/drawingml/2006/main">
+              <a:graphicData uri="http://schemas.openxmlformats.org/drawingml/2006/picture">
+                <pic:pic xmlns:pic="http://schemas.openxmlformats.org/drawingml/2006/picture">
+                  <pic:nvPicPr>
+                    <pic:cNvPr id="0" name=""/>
+                    <pic:cNvPicPr/>
+                  </pic:nvPicPr>
+                  <pic:blipFill>
+                    <a:blip r:embed="rId15"/>
+                    <a:stretch>
+                      <a:fillRect/>
+                    </a:stretch>
+                  </pic:blipFill>
+                  <pic:spPr>
+                    <a:xfrm>
+                      <a:off x="0" y="0"/>
+                      <a:ext cx="5731510" cy="1940508"/>
+                    </a:xfrm>
+                    <a:prstGeom prst="rect">
+                      <a:avLst/>
+                    </a:prstGeom>
+                  </pic:spPr>
+                </pic:pic>
+              </a:graphicData>
+            </a:graphic>
+          </wp:inline>
+        </w:drawing>
+      </w:r>
     </w:p>
     <w:sectPr>
       <w:pgSz w:w="11906" w:h="16838"/>
@@ -508,6 +720,119 @@
 <file path=word/numbering.xml><?xml version="1.0" encoding="utf-8"?>
 <w:numbering xmlns:wpc="http://schemas.microsoft.com/office/word/2010/wordprocessingCanvas" xmlns:mc="http://schemas.openxmlformats.org/markup-compatibility/2006" xmlns:o="urn:schemas-microsoft-com:office:office" xmlns:r="http://schemas.openxmlformats.org/officeDocument/2006/relationships" xmlns:m="http://schemas.openxmlformats.org/officeDocument/2006/math" xmlns:v="urn:schemas-microsoft-com:vml" xmlns:wp14="http://schemas.microsoft.com/office/word/2010/wordprocessingDrawing" xmlns:wp="http://schemas.openxmlformats.org/drawingml/2006/wordprocessingDrawing" xmlns:w10="urn:schemas-microsoft-com:office:word" xmlns:w="http://schemas.openxmlformats.org/wordprocessingml/2006/main" xmlns:w14="http://schemas.microsoft.com/office/word/2010/wordml" xmlns:wpg="http://schemas.microsoft.com/office/word/2010/wordprocessingGroup" xmlns:wpi="http://schemas.microsoft.com/office/word/2010/wordprocessingInk" xmlns:wne="http://schemas.microsoft.com/office/word/2006/wordml" xmlns:wps="http://schemas.microsoft.com/office/word/2010/wordprocessingShape" mc:Ignorable="w14 wp14">
   <w:abstractNum w:abstractNumId="0">
+    <w:nsid w:val="1C4B26EB"/>
+    <w:multiLevelType w:val="multilevel"/>
+    <w:tmpl w:val="91563418"/>
+    <w:lvl w:ilvl="0">
+      <w:start w:val="1"/>
+      <w:numFmt w:val="decimal"/>
+      <w:lvlText w:val="%1."/>
+      <w:lvlJc w:val="left"/>
+      <w:pPr>
+        <w:tabs>
+          <w:tab w:val="num" w:pos="720"/>
+        </w:tabs>
+        <w:ind w:left="720" w:hanging="360"/>
+      </w:pPr>
+    </w:lvl>
+    <w:lvl w:ilvl="1" w:tentative="1">
+      <w:start w:val="1"/>
+      <w:numFmt w:val="decimal"/>
+      <w:lvlText w:val="%2."/>
+      <w:lvlJc w:val="left"/>
+      <w:pPr>
+        <w:tabs>
+          <w:tab w:val="num" w:pos="1440"/>
+        </w:tabs>
+        <w:ind w:left="1440" w:hanging="360"/>
+      </w:pPr>
+    </w:lvl>
+    <w:lvl w:ilvl="2" w:tentative="1">
+      <w:start w:val="1"/>
+      <w:numFmt w:val="decimal"/>
+      <w:lvlText w:val="%3."/>
+      <w:lvlJc w:val="left"/>
+      <w:pPr>
+        <w:tabs>
+          <w:tab w:val="num" w:pos="2160"/>
+        </w:tabs>
+        <w:ind w:left="2160" w:hanging="360"/>
+      </w:pPr>
+    </w:lvl>
+    <w:lvl w:ilvl="3" w:tentative="1">
+      <w:start w:val="1"/>
+      <w:numFmt w:val="decimal"/>
+      <w:lvlText w:val="%4."/>
+      <w:lvlJc w:val="left"/>
+      <w:pPr>
+        <w:tabs>
+          <w:tab w:val="num" w:pos="2880"/>
+        </w:tabs>
+        <w:ind w:left="2880" w:hanging="360"/>
+      </w:pPr>
+    </w:lvl>
+    <w:lvl w:ilvl="4" w:tentative="1">
+      <w:start w:val="1"/>
+      <w:numFmt w:val="decimal"/>
+      <w:lvlText w:val="%5."/>
+      <w:lvlJc w:val="left"/>
+      <w:pPr>
+        <w:tabs>
+          <w:tab w:val="num" w:pos="3600"/>
+        </w:tabs>
+        <w:ind w:left="3600" w:hanging="360"/>
+      </w:pPr>
+    </w:lvl>
+    <w:lvl w:ilvl="5" w:tentative="1">
+      <w:start w:val="1"/>
+      <w:numFmt w:val="decimal"/>
+      <w:lvlText w:val="%6."/>
+      <w:lvlJc w:val="left"/>
+      <w:pPr>
+        <w:tabs>
+          <w:tab w:val="num" w:pos="4320"/>
+        </w:tabs>
+        <w:ind w:left="4320" w:hanging="360"/>
+      </w:pPr>
+    </w:lvl>
+    <w:lvl w:ilvl="6" w:tentative="1">
+      <w:start w:val="1"/>
+      <w:numFmt w:val="decimal"/>
+      <w:lvlText w:val="%7."/>
+      <w:lvlJc w:val="left"/>
+      <w:pPr>
+        <w:tabs>
+          <w:tab w:val="num" w:pos="5040"/>
+        </w:tabs>
+        <w:ind w:left="5040" w:hanging="360"/>
+      </w:pPr>
+    </w:lvl>
+    <w:lvl w:ilvl="7" w:tentative="1">
+      <w:start w:val="1"/>
+      <w:numFmt w:val="decimal"/>
+      <w:lvlText w:val="%8."/>
+      <w:lvlJc w:val="left"/>
+      <w:pPr>
+        <w:tabs>
+          <w:tab w:val="num" w:pos="5760"/>
+        </w:tabs>
+        <w:ind w:left="5760" w:hanging="360"/>
+      </w:pPr>
+    </w:lvl>
+    <w:lvl w:ilvl="8" w:tentative="1">
+      <w:start w:val="1"/>
+      <w:numFmt w:val="decimal"/>
+      <w:lvlText w:val="%9."/>
+      <w:lvlJc w:val="left"/>
+      <w:pPr>
+        <w:tabs>
+          <w:tab w:val="num" w:pos="6480"/>
+        </w:tabs>
+        <w:ind w:left="6480" w:hanging="360"/>
+      </w:pPr>
+    </w:lvl>
+  </w:abstractNum>
+  <w:abstractNum w:abstractNumId="1">
     <w:nsid w:val="278313CF"/>
     <w:multiLevelType w:val="multilevel"/>
     <w:tmpl w:val="364C8F0C"/>
@@ -620,7 +945,96 @@
       </w:pPr>
     </w:lvl>
   </w:abstractNum>
-  <w:abstractNum w:abstractNumId="1">
+  <w:abstractNum w:abstractNumId="2">
+    <w:nsid w:val="4CB61F2A"/>
+    <w:multiLevelType w:val="hybridMultilevel"/>
+    <w:tmpl w:val="489ABB54"/>
+    <w:lvl w:ilvl="0" w:tplc="8F68F98E">
+      <w:start w:val="4"/>
+      <w:numFmt w:val="decimal"/>
+      <w:lvlText w:val="%1"/>
+      <w:lvlJc w:val="left"/>
+      <w:pPr>
+        <w:ind w:left="720" w:hanging="360"/>
+      </w:pPr>
+      <w:rPr>
+        <w:rFonts w:hint="default"/>
+      </w:rPr>
+    </w:lvl>
+    <w:lvl w:ilvl="1" w:tplc="40090019" w:tentative="1">
+      <w:start w:val="1"/>
+      <w:numFmt w:val="lowerLetter"/>
+      <w:lvlText w:val="%2."/>
+      <w:lvlJc w:val="left"/>
+      <w:pPr>
+        <w:ind w:left="1440" w:hanging="360"/>
+      </w:pPr>
+    </w:lvl>
+    <w:lvl w:ilvl="2" w:tplc="4009001B" w:tentative="1">
+      <w:start w:val="1"/>
+      <w:numFmt w:val="lowerRoman"/>
+      <w:lvlText w:val="%3."/>
+      <w:lvlJc w:val="right"/>
+      <w:pPr>
+        <w:ind w:left="2160" w:hanging="180"/>
+      </w:pPr>
+    </w:lvl>
+    <w:lvl w:ilvl="3" w:tplc="4009000F" w:tentative="1">
+      <w:start w:val="1"/>
+      <w:numFmt w:val="decimal"/>
+      <w:lvlText w:val="%4."/>
+      <w:lvlJc w:val="left"/>
+      <w:pPr>
+        <w:ind w:left="2880" w:hanging="360"/>
+      </w:pPr>
+    </w:lvl>
+    <w:lvl w:ilvl="4" w:tplc="40090019" w:tentative="1">
+      <w:start w:val="1"/>
+      <w:numFmt w:val="lowerLetter"/>
+      <w:lvlText w:val="%5."/>
+      <w:lvlJc w:val="left"/>
+      <w:pPr>
+        <w:ind w:left="3600" w:hanging="360"/>
+      </w:pPr>
+    </w:lvl>
+    <w:lvl w:ilvl="5" w:tplc="4009001B" w:tentative="1">
+      <w:start w:val="1"/>
+      <w:numFmt w:val="lowerRoman"/>
+      <w:lvlText w:val="%6."/>
+      <w:lvlJc w:val="right"/>
+      <w:pPr>
+        <w:ind w:left="4320" w:hanging="180"/>
+      </w:pPr>
+    </w:lvl>
+    <w:lvl w:ilvl="6" w:tplc="4009000F" w:tentative="1">
+      <w:start w:val="1"/>
+      <w:numFmt w:val="decimal"/>
+      <w:lvlText w:val="%7."/>
+      <w:lvlJc w:val="left"/>
+      <w:pPr>
+        <w:ind w:left="5040" w:hanging="360"/>
+      </w:pPr>
+    </w:lvl>
+    <w:lvl w:ilvl="7" w:tplc="40090019" w:tentative="1">
+      <w:start w:val="1"/>
+      <w:numFmt w:val="lowerLetter"/>
+      <w:lvlText w:val="%8."/>
+      <w:lvlJc w:val="left"/>
+      <w:pPr>
+        <w:ind w:left="5760" w:hanging="360"/>
+      </w:pPr>
+    </w:lvl>
+    <w:lvl w:ilvl="8" w:tplc="4009001B" w:tentative="1">
+      <w:start w:val="1"/>
+      <w:numFmt w:val="lowerRoman"/>
+      <w:lvlText w:val="%9."/>
+      <w:lvlJc w:val="right"/>
+      <w:pPr>
+        <w:ind w:left="6480" w:hanging="180"/>
+      </w:pPr>
+    </w:lvl>
+  </w:abstractNum>
+  <w:abstractNum w:abstractNumId="3">
     <w:nsid w:val="741A4D56"/>
     <w:multiLevelType w:val="multilevel"/>
     <w:tmpl w:val="2B3C26B4"/>
@@ -734,10 +1148,16 @@
     </w:lvl>
   </w:abstractNum>
   <w:num w:numId="1">
+    <w:abstractNumId w:val="1"/>
+  </w:num>
+  <w:num w:numId="2">
+    <w:abstractNumId w:val="3"/>
+  </w:num>
+  <w:num w:numId="3">
     <w:abstractNumId w:val="0"/>
   </w:num>
-  <w:num w:numId="2">
-    <w:abstractNumId w:val="1"/>
+  <w:num w:numId="4">
+    <w:abstractNumId w:val="2"/>
   </w:num>
 </w:numbering>
 </file>

</xml_diff>